<commit_message>
Pre-fill Samuel details and remove outlines and dashed boxes from print and screen
</commit_message>
<xml_diff>
--- a/EIB_Internship_Completion_Letter.docx
+++ b/EIB_Internship_Completion_Letter.docx
@@ -77,22 +77,14 @@
             </w:r>
             <w:r>
               <w:rPr>
-                <w:color w:val="646E7D"/>
+                <w:color w:val="6E7887"/>
                 <w:sz w:val="17"/>
               </w:rPr>
-              <w:t>Member of EIB Group • RC: 1849204</w:t>
+              <w:t>EIB &amp; SAC FACILITY, OFF UNIGAZ, Idu Industrial Area</w:t>
               <w:br/>
-            </w:r>
-            <w:r>
-              <w:rPr>
-                <w:color w:val="6E7887"/>
-                <w:sz w:val="16"/>
-              </w:rPr>
-              <w:t>Plot 12, Commercial Block, Victoria Island, Lagos, Nigeria</w:t>
+              <w:t>Abuja, Nigeria</w:t>
               <w:br/>
-              <w:t>Tel: +234 (0) 803 000 0000 | +234 (0) 1 290 0000</w:t>
-              <w:br/>
-              <w:t>Email: hr@eibstratoc.com | info@eibgroup.ng</w:t>
+              <w:t>Tel: +234 (0) 900 000 0000</w:t>
               <w:br/>
               <w:t>Website: www.eibstratoc.com</w:t>
             </w:r>
@@ -122,7 +114,7 @@
           <w:color w:val="3C4655"/>
           <w:sz w:val="19"/>
         </w:rPr>
-        <w:t>REF: EIB/HR/SIWES/2026/042</w:t>
+        <w:t>REF: EIB/HR/2026/042</w:t>
         <w:tab/>
         <w:tab/>
         <w:tab/>
@@ -147,15 +139,13 @@
           <w:color w:val="1E2837"/>
           <w:sz w:val="20"/>
         </w:rPr>
-        <w:t>The Coordinator,</w:t>
+        <w:t>The Industrial Training Coordinator,</w:t>
         <w:br/>
-        <w:t>Students Industrial Work Experience Scheme (SIWES) Unit,</w:t>
+        <w:t>Department of EIE COMPUTER ENGINEERING,</w:t>
         <w:br/>
-        <w:t>Directorate of Academic Planning &amp; Industrial Training,</w:t>
+        <w:t>Covenant University,</w:t>
         <w:br/>
-        <w:t>[Name of Tertiary Institution / University / Polytechnic],</w:t>
-        <w:br/>
-        <w:t>[City, State, Nigeria].</w:t>
+        <w:t>Ota, Ogun State, Nigeria.</w:t>
       </w:r>
     </w:p>
     <w:p>
@@ -180,9 +170,9 @@
           <w:color w:val="1B4D89"/>
           <w:sz w:val="22"/>
         </w:rPr>
-        <w:t>LETTER OF COMPLETION OF INDUSTRIAL TRAINING ATTACHMENT</w:t>
+        <w:t>LETTER OF COMPLETION OF INTERNSHIP</w:t>
         <w:br/>
-        <w:t>RE: [STUDENT'S FULL NAME] | MATRIC NO: [MATRICULATION NUMBER]</w:t>
+        <w:t>RE: ADEMUWAGUN OLUWATIMILEHIN SAMUEL | MATRIC NO: 23CJ03334</w:t>
       </w:r>
     </w:p>
     <w:p>
@@ -196,7 +186,7 @@
         <w:rPr>
           <w:b/>
         </w:rPr>
-        <w:t>[STUDENT'S FULL NAME]</w:t>
+        <w:t>ADEMUWAGUN OLUWATIMILEHIN SAMUEL</w:t>
       </w:r>
       <w:r>
         <w:t xml:space="preserve">, a student of the Department of </w:t>
@@ -205,7 +195,16 @@
         <w:rPr>
           <w:b/>
         </w:rPr>
-        <w:t>[Department / Discipline, e.g. Computer Science / Electrical Engineering]</w:t>
+        <w:t>Computer Engineering</w:t>
+      </w:r>
+      <w:r>
+        <w:t xml:space="preserve">, EIE COMPUTER ENGINEERING, </w:t>
+      </w:r>
+      <w:r>
+        <w:rPr>
+          <w:b/>
+        </w:rPr>
+        <w:t>Covenant University</w:t>
       </w:r>
       <w:r>
         <w:t xml:space="preserve">, with Matriculation Number </w:t>
@@ -214,7 +213,7 @@
         <w:rPr>
           <w:b/>
         </w:rPr>
-        <w:t>[MATRICULATION NUMBER]</w:t>
+        <w:t>23CJ03334</w:t>
       </w:r>
       <w:r>
         <w:t xml:space="preserve">, has successfully completed his mandatory </w:t>
@@ -223,10 +222,10 @@
         <w:rPr>
           <w:b/>
         </w:rPr>
-        <w:t>six (6) months (24 weeks)</w:t>
+        <w:t>10 weeks</w:t>
       </w:r>
       <w:r>
-        <w:t xml:space="preserve"> Students Industrial Work Experience Scheme (SIWES) attachment with </w:t>
+        <w:t xml:space="preserve"> internship attachment with </w:t>
       </w:r>
       <w:r>
         <w:rPr>
@@ -241,7 +240,7 @@
         <w:rPr>
           <w:b/>
         </w:rPr>
-        <w:t>14th April, 2026</w:t>
+        <w:t>27th July, 2026</w:t>
       </w:r>
       <w:r>
         <w:t xml:space="preserve"> to </w:t>
@@ -250,7 +249,7 @@
         <w:rPr>
           <w:b/>
         </w:rPr>
-        <w:t>9th October, 2026</w:t>
+        <w:t>2nd October, 2026</w:t>
       </w:r>
       <w:r>
         <w:t>.</w:t>
@@ -261,16 +260,16 @@
         <w:spacing w:after="160" w:line="276" w:lineRule="auto"/>
       </w:pPr>
       <w:r>
-        <w:t xml:space="preserve">During his period of attachment, he was assigned to our </w:t>
+        <w:t xml:space="preserve">During his attachment period, he was deployed to our </w:t>
       </w:r>
       <w:r>
         <w:rPr>
           <w:b/>
         </w:rPr>
-        <w:t>Operations &amp; Technical Services Division</w:t>
+        <w:t>Research and Analysis Wing</w:t>
       </w:r>
       <w:r>
-        <w:t>, where he was exposed to real-world corporate workflows, project execution, quality assurance, system diagnostics, and collaborative technical problem-solving. He demonstrated a keen eagerness to learn, readily grasped complex operational methodologies, and contributed productively to departmental goals.</w:t>
+        <w:t>. Throughout this tenure, he was thoroughly engaged in hands-on industry workflows, software systems operations, troubleshooting, network diagnostic evaluations, and collaborative client support. He exhibited an exemplary aptitude for rapidly absorbing complex operational guidelines and translating technical theory into high-impact practical solutions.</w:t>
       </w:r>
     </w:p>
     <w:p>
@@ -278,7 +277,7 @@
         <w:spacing w:after="160" w:line="276" w:lineRule="auto"/>
       </w:pPr>
       <w:r>
-        <w:t>Throughout the training duration, [Student Name] maintained an exemplary standard of discipline, punctuality, integrity, and professional decorum. He consistently demonstrated high moral character, diligence, team spirit, and strict compliance with our corporate health, safety, and operational regulations.</w:t>
+        <w:t>Throughout his stay at EIB Stratoc Limited, ADEMUWAGUN conducted himself with the highest degree of professionalism, diligence, integrity, and discipline. He was consistently punctual, embraced workplace responsibilities proactively, harmonized well with team colleagues and senior staff, and complied strictly with all corporate and occupational safety standards.</w:t>
       </w:r>
     </w:p>
     <w:p>
@@ -286,7 +285,7 @@
         <w:spacing w:after="320" w:line="276" w:lineRule="auto"/>
       </w:pPr>
       <w:r>
-        <w:t>He has surrendered all company properties in his possession and is hereby fully cleared of all organizational obligations. We commend his outstanding conduct and strongly recommend him for academic grading, certification, and future career engagements. We wish him continued success in his academic pursuits.</w:t>
+        <w:t>Having met and satisfied all required departmental deliverables and performance standards, he has been officially cleared of all organizational obligations. We hereby commend his exceptional performance and unreservedly recommend him for academic assessment, logbook defense, and future professional pursuits.</w:t>
       </w:r>
     </w:p>
     <w:p>
@@ -374,7 +373,7 @@
                 <w:color w:val="1B4D89"/>
                 <w:sz w:val="21"/>
               </w:rPr>
-              <w:t>Marquis</w:t>
+              <w:t>Michael Marquis</w:t>
               <w:br/>
             </w:r>
             <w:r>
@@ -382,11 +381,11 @@
                 <w:color w:val="5A6473"/>
                 <w:sz w:val="18"/>
               </w:rPr>
-              <w:t>Human Resources &amp; Talent Management</w:t>
+              <w:t>Group Head, Training &amp; HRM (DICO)</w:t>
               <w:br/>
               <w:t>EIB Stratoc Limited (EIB Group)</w:t>
               <w:br/>
-              <w:t>Email: hr@eibstratoc.com</w:t>
+              <w:t>Email: hmichael.marquis@eibgroup.com</w:t>
             </w:r>
           </w:p>
         </w:tc>

</xml_diff>